<commit_message>
docs: Ay 2 - 3. Hafta raporuna teknik kaynak özeti eklendi
</commit_message>
<xml_diff>
--- a/ay2/raporlar/Ay2_Hafta3_Rapor.docx
+++ b/ay2/raporlar/Ay2_Hafta3_Rapor.docx
@@ -862,19 +862,7 @@
           <w:rPr>
             <w:rStyle w:val="Kpr"/>
           </w:rPr>
-          <w:t xml:space="preserve"> of Tw</w:t>
-        </w:r>
-        <w:r>
-          <w:rPr>
-            <w:rStyle w:val="Kpr"/>
-          </w:rPr>
-          <w:t>o</w:t>
-        </w:r>
-        <w:r>
-          <w:rPr>
-            <w:rStyle w:val="Kpr"/>
-          </w:rPr>
-          <w:t xml:space="preserve"> </w:t>
+          <w:t xml:space="preserve"> of Two </w:t>
         </w:r>
         <w:proofErr w:type="spellStart"/>
         <w:r>
@@ -1034,6 +1022,450 @@
     </w:p>
     <w:p>
       <w:pPr>
+        <w:spacing w:after="100"/>
+        <w:rPr>
+          <w:color w:val="000000" w:themeColor="text1"/>
+        </w:rPr>
+      </w:pPr>
+    </w:p>
+    <w:p>
+      <w:pPr>
+        <w:spacing w:after="100"/>
+        <w:rPr>
+          <w:b/>
+          <w:bCs/>
+          <w:color w:val="000000" w:themeColor="text1"/>
+          <w:sz w:val="28"/>
+          <w:szCs w:val="28"/>
+        </w:rPr>
+      </w:pPr>
+      <w:hyperlink r:id="rId6" w:history="1">
+        <w:r>
+          <w:rPr>
+            <w:rStyle w:val="Kpr"/>
+            <w:b/>
+            <w:bCs/>
+            <w:sz w:val="28"/>
+            <w:szCs w:val="28"/>
+          </w:rPr>
+          <w:t>2)</w:t>
+        </w:r>
+        <w:proofErr w:type="spellStart"/>
+        <w:r>
+          <w:rPr>
+            <w:rStyle w:val="Kpr"/>
+            <w:b/>
+            <w:bCs/>
+            <w:sz w:val="28"/>
+            <w:szCs w:val="28"/>
+          </w:rPr>
+          <w:t>LeetCode</w:t>
+        </w:r>
+        <w:proofErr w:type="spellEnd"/>
+        <w:r>
+          <w:rPr>
+            <w:rStyle w:val="Kpr"/>
+            <w:b/>
+            <w:bCs/>
+            <w:sz w:val="28"/>
+            <w:szCs w:val="28"/>
+          </w:rPr>
+          <w:t xml:space="preserve"> </w:t>
+        </w:r>
+        <w:proofErr w:type="gramStart"/>
+        <w:r>
+          <w:rPr>
+            <w:rStyle w:val="Kpr"/>
+            <w:b/>
+            <w:bCs/>
+            <w:sz w:val="28"/>
+            <w:szCs w:val="28"/>
+          </w:rPr>
+          <w:t>203 -</w:t>
+        </w:r>
+        <w:proofErr w:type="gramEnd"/>
+        <w:r>
+          <w:rPr>
+            <w:rStyle w:val="Kpr"/>
+            <w:b/>
+            <w:bCs/>
+            <w:sz w:val="28"/>
+            <w:szCs w:val="28"/>
+          </w:rPr>
+          <w:t xml:space="preserve"> </w:t>
+        </w:r>
+        <w:proofErr w:type="spellStart"/>
+        <w:r>
+          <w:rPr>
+            <w:rStyle w:val="Kpr"/>
+            <w:b/>
+            <w:bCs/>
+            <w:sz w:val="28"/>
+            <w:szCs w:val="28"/>
+          </w:rPr>
+          <w:t>Remove</w:t>
+        </w:r>
+        <w:proofErr w:type="spellEnd"/>
+        <w:r>
+          <w:rPr>
+            <w:rStyle w:val="Kpr"/>
+            <w:b/>
+            <w:bCs/>
+            <w:sz w:val="28"/>
+            <w:szCs w:val="28"/>
+          </w:rPr>
+          <w:t xml:space="preserve"> </w:t>
+        </w:r>
+        <w:proofErr w:type="spellStart"/>
+        <w:r>
+          <w:rPr>
+            <w:rStyle w:val="Kpr"/>
+            <w:b/>
+            <w:bCs/>
+            <w:sz w:val="28"/>
+            <w:szCs w:val="28"/>
+          </w:rPr>
+          <w:t>Linked</w:t>
+        </w:r>
+        <w:proofErr w:type="spellEnd"/>
+        <w:r>
+          <w:rPr>
+            <w:rStyle w:val="Kpr"/>
+            <w:b/>
+            <w:bCs/>
+            <w:sz w:val="28"/>
+            <w:szCs w:val="28"/>
+          </w:rPr>
+          <w:t xml:space="preserve"> </w:t>
+        </w:r>
+        <w:proofErr w:type="spellStart"/>
+        <w:r>
+          <w:rPr>
+            <w:rStyle w:val="Kpr"/>
+            <w:b/>
+            <w:bCs/>
+            <w:sz w:val="28"/>
+            <w:szCs w:val="28"/>
+          </w:rPr>
+          <w:t>List</w:t>
+        </w:r>
+        <w:proofErr w:type="spellEnd"/>
+        <w:r>
+          <w:rPr>
+            <w:rStyle w:val="Kpr"/>
+            <w:b/>
+            <w:bCs/>
+            <w:sz w:val="28"/>
+            <w:szCs w:val="28"/>
+          </w:rPr>
+          <w:t xml:space="preserve"> </w:t>
+        </w:r>
+        <w:proofErr w:type="spellStart"/>
+        <w:r>
+          <w:rPr>
+            <w:rStyle w:val="Kpr"/>
+            <w:b/>
+            <w:bCs/>
+            <w:sz w:val="28"/>
+            <w:szCs w:val="28"/>
+          </w:rPr>
+          <w:t>Elements</w:t>
+        </w:r>
+        <w:proofErr w:type="spellEnd"/>
+      </w:hyperlink>
+    </w:p>
+    <w:p>
+      <w:pPr>
+        <w:spacing w:after="100"/>
+        <w:rPr>
+          <w:color w:val="000000" w:themeColor="text1"/>
+        </w:rPr>
+      </w:pPr>
+      <w:r>
+        <w:rPr>
+          <w:color w:val="000000" w:themeColor="text1"/>
+        </w:rPr>
+        <w:t xml:space="preserve">Bu problemde bağlı listeden, değeri belirli bir sayıya eşit olan tüm </w:t>
+      </w:r>
+      <w:proofErr w:type="spellStart"/>
+      <w:r>
+        <w:rPr>
+          <w:color w:val="000000" w:themeColor="text1"/>
+        </w:rPr>
+        <w:t>node'ları</w:t>
+      </w:r>
+      <w:proofErr w:type="spellEnd"/>
+      <w:r>
+        <w:rPr>
+          <w:color w:val="000000" w:themeColor="text1"/>
+        </w:rPr>
+        <w:t xml:space="preserve"> silmem isteniyordu. En zor kısmı, silinmesi gereken </w:t>
+      </w:r>
+      <w:proofErr w:type="spellStart"/>
+      <w:r>
+        <w:rPr>
+          <w:color w:val="000000" w:themeColor="text1"/>
+        </w:rPr>
+        <w:t>node'un</w:t>
+      </w:r>
+      <w:proofErr w:type="spellEnd"/>
+      <w:r>
+        <w:rPr>
+          <w:color w:val="000000" w:themeColor="text1"/>
+        </w:rPr>
+        <w:t xml:space="preserve"> listenin en başında (</w:t>
+      </w:r>
+      <w:proofErr w:type="spellStart"/>
+      <w:r>
+        <w:rPr>
+          <w:color w:val="000000" w:themeColor="text1"/>
+        </w:rPr>
+        <w:t>head</w:t>
+      </w:r>
+      <w:proofErr w:type="spellEnd"/>
+      <w:r>
+        <w:rPr>
+          <w:color w:val="000000" w:themeColor="text1"/>
+        </w:rPr>
+        <w:t xml:space="preserve">) olabilmesiydi, çünkü </w:t>
+      </w:r>
+      <w:proofErr w:type="spellStart"/>
+      <w:r>
+        <w:rPr>
+          <w:color w:val="000000" w:themeColor="text1"/>
+        </w:rPr>
+        <w:t>head'i</w:t>
+      </w:r>
+      <w:proofErr w:type="spellEnd"/>
+      <w:r>
+        <w:rPr>
+          <w:color w:val="000000" w:themeColor="text1"/>
+        </w:rPr>
+        <w:t xml:space="preserve"> silmek normal bir </w:t>
+      </w:r>
+      <w:proofErr w:type="spellStart"/>
+      <w:r>
+        <w:rPr>
+          <w:color w:val="000000" w:themeColor="text1"/>
+        </w:rPr>
+        <w:t>node'u</w:t>
+      </w:r>
+      <w:proofErr w:type="spellEnd"/>
+      <w:r>
+        <w:rPr>
+          <w:color w:val="000000" w:themeColor="text1"/>
+        </w:rPr>
+        <w:t xml:space="preserve"> silmekten farklı davranıyor.</w:t>
+      </w:r>
+    </w:p>
+    <w:p>
+      <w:pPr>
+        <w:spacing w:after="100"/>
+        <w:rPr>
+          <w:color w:val="000000" w:themeColor="text1"/>
+        </w:rPr>
+      </w:pPr>
+      <w:r>
+        <w:rPr>
+          <w:color w:val="000000" w:themeColor="text1"/>
+        </w:rPr>
+        <w:t xml:space="preserve">Bunu çözmek için </w:t>
+      </w:r>
+      <w:r>
+        <w:rPr>
+          <w:color w:val="000000" w:themeColor="text1"/>
+        </w:rPr>
+        <w:t xml:space="preserve">geçici bir </w:t>
+      </w:r>
+      <w:proofErr w:type="spellStart"/>
+      <w:r>
+        <w:rPr>
+          <w:color w:val="000000" w:themeColor="text1"/>
+        </w:rPr>
+        <w:t>node</w:t>
+      </w:r>
+      <w:proofErr w:type="spellEnd"/>
+      <w:r>
+        <w:rPr>
+          <w:color w:val="000000" w:themeColor="text1"/>
+        </w:rPr>
+        <w:t xml:space="preserve"> </w:t>
+      </w:r>
+      <w:r>
+        <w:rPr>
+          <w:color w:val="000000" w:themeColor="text1"/>
+        </w:rPr>
+        <w:t xml:space="preserve">kullandım. Gerçek listenin önüne değeri önemsiz bir </w:t>
+      </w:r>
+      <w:proofErr w:type="spellStart"/>
+      <w:r>
+        <w:rPr>
+          <w:color w:val="000000" w:themeColor="text1"/>
+        </w:rPr>
+        <w:t>temp</w:t>
+      </w:r>
+      <w:proofErr w:type="spellEnd"/>
+      <w:r>
+        <w:rPr>
+          <w:color w:val="000000" w:themeColor="text1"/>
+        </w:rPr>
+        <w:t xml:space="preserve"> </w:t>
+      </w:r>
+      <w:proofErr w:type="spellStart"/>
+      <w:r>
+        <w:rPr>
+          <w:color w:val="000000" w:themeColor="text1"/>
+        </w:rPr>
+        <w:t>node</w:t>
+      </w:r>
+      <w:proofErr w:type="spellEnd"/>
+      <w:r>
+        <w:rPr>
+          <w:color w:val="000000" w:themeColor="text1"/>
+        </w:rPr>
+        <w:t xml:space="preserve"> ekleyip onu </w:t>
+      </w:r>
+      <w:proofErr w:type="spellStart"/>
+      <w:r>
+        <w:rPr>
+          <w:color w:val="000000" w:themeColor="text1"/>
+        </w:rPr>
+        <w:t>head'e</w:t>
+      </w:r>
+      <w:proofErr w:type="spellEnd"/>
+      <w:r>
+        <w:rPr>
+          <w:color w:val="000000" w:themeColor="text1"/>
+        </w:rPr>
+        <w:t xml:space="preserve"> bağladım. Böylece </w:t>
+      </w:r>
+      <w:proofErr w:type="spellStart"/>
+      <w:r>
+        <w:rPr>
+          <w:color w:val="000000" w:themeColor="text1"/>
+        </w:rPr>
+        <w:t>head'in</w:t>
+      </w:r>
+      <w:proofErr w:type="spellEnd"/>
+      <w:r>
+        <w:rPr>
+          <w:color w:val="000000" w:themeColor="text1"/>
+        </w:rPr>
+        <w:t xml:space="preserve"> silinmesi durumu, artık özel bir kontrol gerektirmeden diğer </w:t>
+      </w:r>
+      <w:proofErr w:type="spellStart"/>
+      <w:r>
+        <w:rPr>
+          <w:color w:val="000000" w:themeColor="text1"/>
+        </w:rPr>
+        <w:t>node'ların</w:t>
+      </w:r>
+      <w:proofErr w:type="spellEnd"/>
+      <w:r>
+        <w:rPr>
+          <w:color w:val="000000" w:themeColor="text1"/>
+        </w:rPr>
+        <w:t xml:space="preserve"> silinmesiyle aynı mantığa uydu. Listeyi </w:t>
+      </w:r>
+      <w:proofErr w:type="spellStart"/>
+      <w:r>
+        <w:rPr>
+          <w:color w:val="000000" w:themeColor="text1"/>
+        </w:rPr>
+        <w:t>temp</w:t>
+      </w:r>
+      <w:r>
+        <w:rPr>
+          <w:color w:val="000000" w:themeColor="text1"/>
+        </w:rPr>
+        <w:t>'den</w:t>
+      </w:r>
+      <w:proofErr w:type="spellEnd"/>
+      <w:r>
+        <w:rPr>
+          <w:color w:val="000000" w:themeColor="text1"/>
+        </w:rPr>
+        <w:t xml:space="preserve"> başlayarak gezip, bir sonraki </w:t>
+      </w:r>
+      <w:proofErr w:type="spellStart"/>
+      <w:r>
+        <w:rPr>
+          <w:color w:val="000000" w:themeColor="text1"/>
+        </w:rPr>
+        <w:t>node'un</w:t>
+      </w:r>
+      <w:proofErr w:type="spellEnd"/>
+      <w:r>
+        <w:rPr>
+          <w:color w:val="000000" w:themeColor="text1"/>
+        </w:rPr>
+        <w:t xml:space="preserve"> değeri aranan değere eşitse o </w:t>
+      </w:r>
+      <w:proofErr w:type="spellStart"/>
+      <w:r>
+        <w:rPr>
+          <w:color w:val="000000" w:themeColor="text1"/>
+        </w:rPr>
+        <w:t>node'u</w:t>
+      </w:r>
+      <w:proofErr w:type="spellEnd"/>
+      <w:r>
+        <w:rPr>
+          <w:color w:val="000000" w:themeColor="text1"/>
+        </w:rPr>
+        <w:t xml:space="preserve"> atlayarak sildim, değilse bir ileri gittim.</w:t>
+      </w:r>
+    </w:p>
+    <w:p>
+      <w:pPr>
+        <w:spacing w:after="100"/>
+        <w:rPr>
+          <w:color w:val="000000" w:themeColor="text1"/>
+        </w:rPr>
+      </w:pPr>
+      <w:r>
+        <w:rPr>
+          <w:color w:val="000000" w:themeColor="text1"/>
+        </w:rPr>
+        <w:t xml:space="preserve">Zaman karmaşıklığı O(n) oldu çünkü liste sadece bir kez baştan sona gezildi, alan karmaşıklığı da </w:t>
+      </w:r>
+      <w:proofErr w:type="gramStart"/>
+      <w:r>
+        <w:rPr>
+          <w:color w:val="000000" w:themeColor="text1"/>
+        </w:rPr>
+        <w:t>O(</w:t>
+      </w:r>
+      <w:proofErr w:type="gramEnd"/>
+      <w:r>
+        <w:rPr>
+          <w:color w:val="000000" w:themeColor="text1"/>
+        </w:rPr>
+        <w:t>1) kaldı çünkü yeni bir liste oluşturmadım, sadece iki referans</w:t>
+      </w:r>
+      <w:r>
+        <w:rPr>
+          <w:color w:val="000000" w:themeColor="text1"/>
+        </w:rPr>
+        <w:t xml:space="preserve"> </w:t>
+      </w:r>
+      <w:r>
+        <w:rPr>
+          <w:color w:val="000000" w:themeColor="text1"/>
+        </w:rPr>
+        <w:t>kullandım.</w:t>
+      </w:r>
+    </w:p>
+    <w:p>
+      <w:pPr>
+        <w:spacing w:after="100"/>
+        <w:rPr>
+          <w:color w:val="000000" w:themeColor="text1"/>
+        </w:rPr>
+      </w:pPr>
+    </w:p>
+    <w:p>
+      <w:pPr>
         <w:pStyle w:val="Balk1"/>
         <w:spacing w:before="300" w:after="150"/>
         <w:rPr>
@@ -1046,6 +1478,863 @@
         </w:rPr>
         <w:t>3. Teknik Kaynak Özeti</w:t>
       </w:r>
+    </w:p>
+    <w:p>
+      <w:pPr>
+        <w:pStyle w:val="Balk1"/>
+        <w:spacing w:before="300" w:after="150"/>
+        <w:rPr>
+          <w:color w:val="000000" w:themeColor="text1"/>
+        </w:rPr>
+      </w:pPr>
+    </w:p>
+    <w:p>
+      <w:pPr>
+        <w:pStyle w:val="Balk1"/>
+        <w:spacing w:before="300" w:after="150"/>
+        <w:rPr>
+          <w:color w:val="000000" w:themeColor="text1"/>
+        </w:rPr>
+      </w:pPr>
+    </w:p>
+    <w:p>
+      <w:pPr>
+        <w:pStyle w:val="Balk1"/>
+        <w:spacing w:before="300" w:after="150"/>
+        <w:rPr>
+          <w:color w:val="000000" w:themeColor="text1"/>
+          <w:sz w:val="22"/>
+          <w:szCs w:val="22"/>
+        </w:rPr>
+      </w:pPr>
+      <w:r>
+        <w:rPr>
+          <w:color w:val="000000" w:themeColor="text1"/>
+        </w:rPr>
+        <w:t xml:space="preserve">    </w:t>
+      </w:r>
+      <w:r>
+        <w:rPr>
+          <w:color w:val="000000" w:themeColor="text1"/>
+          <w:sz w:val="22"/>
+          <w:szCs w:val="22"/>
+        </w:rPr>
+        <w:t xml:space="preserve">Bu makalede ilk olarak </w:t>
+      </w:r>
+      <w:proofErr w:type="spellStart"/>
+      <w:r>
+        <w:rPr>
+          <w:color w:val="000000" w:themeColor="text1"/>
+          <w:sz w:val="22"/>
+          <w:szCs w:val="22"/>
+        </w:rPr>
+        <w:t>graph</w:t>
+      </w:r>
+      <w:proofErr w:type="spellEnd"/>
+      <w:r>
+        <w:rPr>
+          <w:color w:val="000000" w:themeColor="text1"/>
+          <w:sz w:val="22"/>
+          <w:szCs w:val="22"/>
+        </w:rPr>
+        <w:t xml:space="preserve"> yapılarının</w:t>
+      </w:r>
+      <w:r>
+        <w:rPr>
+          <w:color w:val="auto"/>
+          <w:sz w:val="22"/>
+          <w:szCs w:val="22"/>
+        </w:rPr>
+        <w:t xml:space="preserve"> </w:t>
+      </w:r>
+      <w:r>
+        <w:rPr>
+          <w:color w:val="000000" w:themeColor="text1"/>
+          <w:sz w:val="22"/>
+          <w:szCs w:val="22"/>
+        </w:rPr>
+        <w:t xml:space="preserve">nesneler arasındaki ilişkileri ve ağları göstermek için kullanılabileceği anlatılmıştır. </w:t>
+      </w:r>
+      <w:proofErr w:type="spellStart"/>
+      <w:r>
+        <w:rPr>
+          <w:color w:val="000000" w:themeColor="text1"/>
+          <w:sz w:val="22"/>
+          <w:szCs w:val="22"/>
+        </w:rPr>
+        <w:t>Graphların</w:t>
+      </w:r>
+      <w:proofErr w:type="spellEnd"/>
+      <w:r>
+        <w:rPr>
+          <w:color w:val="000000" w:themeColor="text1"/>
+          <w:sz w:val="22"/>
+          <w:szCs w:val="22"/>
+        </w:rPr>
+        <w:t xml:space="preserve"> kullanılmasında yaygın olarak </w:t>
+      </w:r>
+      <w:proofErr w:type="spellStart"/>
+      <w:r>
+        <w:rPr>
+          <w:color w:val="000000" w:themeColor="text1"/>
+          <w:sz w:val="22"/>
+          <w:szCs w:val="22"/>
+        </w:rPr>
+        <w:t>adjacency</w:t>
+      </w:r>
+      <w:proofErr w:type="spellEnd"/>
+      <w:r>
+        <w:rPr>
+          <w:color w:val="000000" w:themeColor="text1"/>
+          <w:sz w:val="22"/>
+          <w:szCs w:val="22"/>
+        </w:rPr>
+        <w:t xml:space="preserve"> </w:t>
+      </w:r>
+      <w:proofErr w:type="spellStart"/>
+      <w:r>
+        <w:rPr>
+          <w:color w:val="000000" w:themeColor="text1"/>
+          <w:sz w:val="22"/>
+          <w:szCs w:val="22"/>
+        </w:rPr>
+        <w:t>list</w:t>
+      </w:r>
+      <w:proofErr w:type="spellEnd"/>
+      <w:r>
+        <w:rPr>
+          <w:color w:val="000000" w:themeColor="text1"/>
+          <w:sz w:val="22"/>
+          <w:szCs w:val="22"/>
+        </w:rPr>
+        <w:t xml:space="preserve"> (komşuluk listesi) kullanılır ve bu yapıda her düğümün bağlı olduğu diğer düğümler bir liste içerisinde tutulur.</w:t>
+      </w:r>
+      <w:r>
+        <w:rPr>
+          <w:color w:val="auto"/>
+          <w:sz w:val="22"/>
+          <w:szCs w:val="22"/>
+        </w:rPr>
+        <w:t xml:space="preserve"> </w:t>
+      </w:r>
+      <w:r>
+        <w:rPr>
+          <w:color w:val="000000" w:themeColor="text1"/>
+          <w:sz w:val="22"/>
+          <w:szCs w:val="22"/>
+        </w:rPr>
+        <w:t xml:space="preserve">Daha sonra </w:t>
+      </w:r>
+      <w:proofErr w:type="spellStart"/>
+      <w:r>
+        <w:rPr>
+          <w:color w:val="000000" w:themeColor="text1"/>
+          <w:sz w:val="22"/>
+          <w:szCs w:val="22"/>
+        </w:rPr>
+        <w:t>linked</w:t>
+      </w:r>
+      <w:proofErr w:type="spellEnd"/>
+      <w:r>
+        <w:rPr>
+          <w:color w:val="000000" w:themeColor="text1"/>
+          <w:sz w:val="22"/>
+          <w:szCs w:val="22"/>
+        </w:rPr>
+        <w:t xml:space="preserve"> </w:t>
+      </w:r>
+      <w:proofErr w:type="spellStart"/>
+      <w:r>
+        <w:rPr>
+          <w:color w:val="000000" w:themeColor="text1"/>
+          <w:sz w:val="22"/>
+          <w:szCs w:val="22"/>
+        </w:rPr>
+        <w:t>listlerin</w:t>
+      </w:r>
+      <w:proofErr w:type="spellEnd"/>
+      <w:r>
+        <w:rPr>
+          <w:color w:val="000000" w:themeColor="text1"/>
+          <w:sz w:val="22"/>
+          <w:szCs w:val="22"/>
+        </w:rPr>
+        <w:t xml:space="preserve"> normal Python listelerinden farkları ve hangi işlemlerde daha avantajlı oldukları açıklanmıştır. Özellikle </w:t>
+      </w:r>
+      <w:proofErr w:type="spellStart"/>
+      <w:r>
+        <w:rPr>
+          <w:color w:val="000000" w:themeColor="text1"/>
+          <w:sz w:val="22"/>
+          <w:szCs w:val="22"/>
+        </w:rPr>
+        <w:t>linked</w:t>
+      </w:r>
+      <w:proofErr w:type="spellEnd"/>
+      <w:r>
+        <w:rPr>
+          <w:color w:val="000000" w:themeColor="text1"/>
+          <w:sz w:val="22"/>
+          <w:szCs w:val="22"/>
+        </w:rPr>
+        <w:t xml:space="preserve"> </w:t>
+      </w:r>
+      <w:proofErr w:type="spellStart"/>
+      <w:r>
+        <w:rPr>
+          <w:color w:val="000000" w:themeColor="text1"/>
+          <w:sz w:val="22"/>
+          <w:szCs w:val="22"/>
+        </w:rPr>
+        <w:t>listlerde</w:t>
+      </w:r>
+      <w:proofErr w:type="spellEnd"/>
+      <w:r>
+        <w:rPr>
+          <w:color w:val="000000" w:themeColor="text1"/>
+          <w:sz w:val="22"/>
+          <w:szCs w:val="22"/>
+        </w:rPr>
+        <w:t xml:space="preserve"> eleman ekleme ve silme işlemleri uygun konumlarda daha hızlı yapılabilirken, belirli bir elemana erişmek normal listelere göre daha yavaş olduğu anlatılmıştır.</w:t>
+      </w:r>
+    </w:p>
+    <w:p>
+      <w:pPr>
+        <w:pStyle w:val="Balk1"/>
+        <w:spacing w:before="300" w:after="150"/>
+        <w:rPr>
+          <w:color w:val="000000" w:themeColor="text1"/>
+          <w:sz w:val="22"/>
+          <w:szCs w:val="22"/>
+        </w:rPr>
+      </w:pPr>
+      <w:r>
+        <w:rPr>
+          <w:color w:val="000000" w:themeColor="text1"/>
+          <w:sz w:val="22"/>
+          <w:szCs w:val="22"/>
+        </w:rPr>
+        <w:t xml:space="preserve">    Python'da </w:t>
+      </w:r>
+      <w:proofErr w:type="spellStart"/>
+      <w:proofErr w:type="gramStart"/>
+      <w:r>
+        <w:rPr>
+          <w:color w:val="000000" w:themeColor="text1"/>
+          <w:sz w:val="22"/>
+          <w:szCs w:val="22"/>
+        </w:rPr>
+        <w:t>collections.deque</w:t>
+      </w:r>
+      <w:proofErr w:type="spellEnd"/>
+      <w:proofErr w:type="gramEnd"/>
+      <w:r>
+        <w:rPr>
+          <w:color w:val="000000" w:themeColor="text1"/>
+          <w:sz w:val="22"/>
+          <w:szCs w:val="22"/>
+        </w:rPr>
+        <w:t xml:space="preserve"> yapısı, listenin hem başından hem de sonundan hızlı bir şekilde eleman ekleyip çıkarmak için kullanılabilir. Bu yüzden </w:t>
+      </w:r>
+      <w:proofErr w:type="spellStart"/>
+      <w:r>
+        <w:rPr>
+          <w:color w:val="000000" w:themeColor="text1"/>
+          <w:sz w:val="22"/>
+          <w:szCs w:val="22"/>
+        </w:rPr>
+        <w:t>queue</w:t>
+      </w:r>
+      <w:proofErr w:type="spellEnd"/>
+      <w:r>
+        <w:rPr>
+          <w:color w:val="000000" w:themeColor="text1"/>
+          <w:sz w:val="22"/>
+          <w:szCs w:val="22"/>
+        </w:rPr>
+        <w:t xml:space="preserve"> ve </w:t>
+      </w:r>
+      <w:proofErr w:type="spellStart"/>
+      <w:r>
+        <w:rPr>
+          <w:color w:val="000000" w:themeColor="text1"/>
+          <w:sz w:val="22"/>
+          <w:szCs w:val="22"/>
+        </w:rPr>
+        <w:t>stack</w:t>
+      </w:r>
+      <w:proofErr w:type="spellEnd"/>
+      <w:r>
+        <w:rPr>
+          <w:color w:val="000000" w:themeColor="text1"/>
+          <w:sz w:val="22"/>
+          <w:szCs w:val="22"/>
+        </w:rPr>
+        <w:t xml:space="preserve"> gibi veri yapılarında kullanışlıdır. Queue yapısında ilk giren eleman ilk çıkar (FIFO), </w:t>
+      </w:r>
+      <w:proofErr w:type="spellStart"/>
+      <w:r>
+        <w:rPr>
+          <w:color w:val="000000" w:themeColor="text1"/>
+          <w:sz w:val="22"/>
+          <w:szCs w:val="22"/>
+        </w:rPr>
+        <w:t>Stack</w:t>
+      </w:r>
+      <w:proofErr w:type="spellEnd"/>
+      <w:r>
+        <w:rPr>
+          <w:color w:val="000000" w:themeColor="text1"/>
+          <w:sz w:val="22"/>
+          <w:szCs w:val="22"/>
+        </w:rPr>
+        <w:t xml:space="preserve"> yapısında ise son giren eleman ilk çıkar (LIFO).</w:t>
+      </w:r>
+    </w:p>
+    <w:p>
+      <w:pPr>
+        <w:pStyle w:val="Balk1"/>
+        <w:spacing w:before="300" w:after="150"/>
+        <w:rPr>
+          <w:color w:val="000000" w:themeColor="text1"/>
+          <w:sz w:val="22"/>
+          <w:szCs w:val="22"/>
+        </w:rPr>
+      </w:pPr>
+      <w:r>
+        <w:rPr>
+          <w:color w:val="000000" w:themeColor="text1"/>
+          <w:sz w:val="22"/>
+          <w:szCs w:val="22"/>
+        </w:rPr>
+        <w:t xml:space="preserve">    </w:t>
+      </w:r>
+      <w:proofErr w:type="spellStart"/>
+      <w:r>
+        <w:rPr>
+          <w:color w:val="000000" w:themeColor="text1"/>
+          <w:sz w:val="22"/>
+          <w:szCs w:val="22"/>
+        </w:rPr>
+        <w:t>Linked</w:t>
+      </w:r>
+      <w:proofErr w:type="spellEnd"/>
+      <w:r>
+        <w:rPr>
+          <w:color w:val="000000" w:themeColor="text1"/>
+          <w:sz w:val="22"/>
+          <w:szCs w:val="22"/>
+        </w:rPr>
+        <w:t xml:space="preserve"> </w:t>
+      </w:r>
+      <w:proofErr w:type="spellStart"/>
+      <w:r>
+        <w:rPr>
+          <w:color w:val="000000" w:themeColor="text1"/>
+          <w:sz w:val="22"/>
+          <w:szCs w:val="22"/>
+        </w:rPr>
+        <w:t>list</w:t>
+      </w:r>
+      <w:proofErr w:type="spellEnd"/>
+      <w:r>
+        <w:rPr>
+          <w:color w:val="000000" w:themeColor="text1"/>
+          <w:sz w:val="22"/>
+          <w:szCs w:val="22"/>
+        </w:rPr>
+        <w:t xml:space="preserve"> oluşturmak için </w:t>
+      </w:r>
+      <w:proofErr w:type="spellStart"/>
+      <w:r>
+        <w:rPr>
+          <w:color w:val="000000" w:themeColor="text1"/>
+          <w:sz w:val="22"/>
+          <w:szCs w:val="22"/>
+        </w:rPr>
+        <w:t>Node</w:t>
+      </w:r>
+      <w:proofErr w:type="spellEnd"/>
+      <w:r>
+        <w:rPr>
+          <w:color w:val="000000" w:themeColor="text1"/>
+          <w:sz w:val="22"/>
+          <w:szCs w:val="22"/>
+        </w:rPr>
+        <w:t xml:space="preserve"> ve </w:t>
+      </w:r>
+      <w:proofErr w:type="spellStart"/>
+      <w:r>
+        <w:rPr>
+          <w:color w:val="000000" w:themeColor="text1"/>
+          <w:sz w:val="22"/>
+          <w:szCs w:val="22"/>
+        </w:rPr>
+        <w:t>LinkedList</w:t>
+      </w:r>
+      <w:proofErr w:type="spellEnd"/>
+      <w:r>
+        <w:rPr>
+          <w:color w:val="000000" w:themeColor="text1"/>
+          <w:sz w:val="22"/>
+          <w:szCs w:val="22"/>
+        </w:rPr>
+        <w:t xml:space="preserve"> sınıfları kullanılabilir. Her </w:t>
+      </w:r>
+      <w:proofErr w:type="spellStart"/>
+      <w:r>
+        <w:rPr>
+          <w:color w:val="000000" w:themeColor="text1"/>
+          <w:sz w:val="22"/>
+          <w:szCs w:val="22"/>
+        </w:rPr>
+        <w:t>node</w:t>
+      </w:r>
+      <w:proofErr w:type="spellEnd"/>
+      <w:r>
+        <w:rPr>
+          <w:color w:val="000000" w:themeColor="text1"/>
+          <w:sz w:val="22"/>
+          <w:szCs w:val="22"/>
+        </w:rPr>
+        <w:t xml:space="preserve"> içerisinde verinin yanında bir sonraki </w:t>
+      </w:r>
+      <w:proofErr w:type="spellStart"/>
+      <w:r>
+        <w:rPr>
+          <w:color w:val="000000" w:themeColor="text1"/>
+          <w:sz w:val="22"/>
+          <w:szCs w:val="22"/>
+        </w:rPr>
+        <w:t>node'u</w:t>
+      </w:r>
+      <w:proofErr w:type="spellEnd"/>
+      <w:r>
+        <w:rPr>
+          <w:color w:val="000000" w:themeColor="text1"/>
+          <w:sz w:val="22"/>
+          <w:szCs w:val="22"/>
+        </w:rPr>
+        <w:t xml:space="preserve"> gösteren </w:t>
+      </w:r>
+      <w:proofErr w:type="spellStart"/>
+      <w:r>
+        <w:rPr>
+          <w:color w:val="000000" w:themeColor="text1"/>
+          <w:sz w:val="22"/>
+          <w:szCs w:val="22"/>
+        </w:rPr>
+        <w:t>next</w:t>
+      </w:r>
+      <w:proofErr w:type="spellEnd"/>
+      <w:r>
+        <w:rPr>
+          <w:color w:val="000000" w:themeColor="text1"/>
+          <w:sz w:val="22"/>
+          <w:szCs w:val="22"/>
+        </w:rPr>
+        <w:t xml:space="preserve"> bağlantısı bulunur. Bu yapı üzerinde listeyi dolaşma, başa veya sona eleman ekleme, belirli bir elemandan önce veya sonra yeni eleman ekleme ve eleman silme gibi işlemler yapılabilir.</w:t>
+      </w:r>
+    </w:p>
+    <w:p>
+      <w:pPr>
+        <w:pStyle w:val="Balk1"/>
+        <w:spacing w:before="300" w:after="150"/>
+        <w:rPr>
+          <w:color w:val="000000" w:themeColor="text1"/>
+          <w:sz w:val="22"/>
+          <w:szCs w:val="22"/>
+        </w:rPr>
+      </w:pPr>
+      <w:r>
+        <w:rPr>
+          <w:color w:val="000000" w:themeColor="text1"/>
+          <w:sz w:val="22"/>
+          <w:szCs w:val="22"/>
+        </w:rPr>
+        <w:t xml:space="preserve">    </w:t>
+      </w:r>
+      <w:proofErr w:type="spellStart"/>
+      <w:r>
+        <w:rPr>
+          <w:color w:val="000000" w:themeColor="text1"/>
+          <w:sz w:val="22"/>
+          <w:szCs w:val="22"/>
+        </w:rPr>
+        <w:t>Linked</w:t>
+      </w:r>
+      <w:proofErr w:type="spellEnd"/>
+      <w:r>
+        <w:rPr>
+          <w:color w:val="000000" w:themeColor="text1"/>
+          <w:sz w:val="22"/>
+          <w:szCs w:val="22"/>
+        </w:rPr>
+        <w:t xml:space="preserve"> </w:t>
+      </w:r>
+      <w:proofErr w:type="spellStart"/>
+      <w:r>
+        <w:rPr>
+          <w:color w:val="000000" w:themeColor="text1"/>
+          <w:sz w:val="22"/>
+          <w:szCs w:val="22"/>
+        </w:rPr>
+        <w:t>listlerin</w:t>
+      </w:r>
+      <w:proofErr w:type="spellEnd"/>
+      <w:r>
+        <w:rPr>
+          <w:color w:val="000000" w:themeColor="text1"/>
+          <w:sz w:val="22"/>
+          <w:szCs w:val="22"/>
+        </w:rPr>
+        <w:t xml:space="preserve"> farklı türleri de bulunmaktadır. </w:t>
+      </w:r>
+      <w:proofErr w:type="spellStart"/>
+      <w:r>
+        <w:rPr>
+          <w:color w:val="000000" w:themeColor="text1"/>
+          <w:sz w:val="22"/>
+          <w:szCs w:val="22"/>
+        </w:rPr>
+        <w:t>Singly</w:t>
+      </w:r>
+      <w:proofErr w:type="spellEnd"/>
+      <w:r>
+        <w:rPr>
+          <w:color w:val="000000" w:themeColor="text1"/>
+          <w:sz w:val="22"/>
+          <w:szCs w:val="22"/>
+        </w:rPr>
+        <w:t xml:space="preserve"> </w:t>
+      </w:r>
+      <w:proofErr w:type="spellStart"/>
+      <w:r>
+        <w:rPr>
+          <w:color w:val="000000" w:themeColor="text1"/>
+          <w:sz w:val="22"/>
+          <w:szCs w:val="22"/>
+        </w:rPr>
+        <w:t>linked</w:t>
+      </w:r>
+      <w:proofErr w:type="spellEnd"/>
+      <w:r>
+        <w:rPr>
+          <w:color w:val="000000" w:themeColor="text1"/>
+          <w:sz w:val="22"/>
+          <w:szCs w:val="22"/>
+        </w:rPr>
+        <w:t xml:space="preserve"> </w:t>
+      </w:r>
+      <w:proofErr w:type="spellStart"/>
+      <w:r>
+        <w:rPr>
+          <w:color w:val="000000" w:themeColor="text1"/>
+          <w:sz w:val="22"/>
+          <w:szCs w:val="22"/>
+        </w:rPr>
+        <w:t>listlerde</w:t>
+      </w:r>
+      <w:proofErr w:type="spellEnd"/>
+      <w:r>
+        <w:rPr>
+          <w:color w:val="000000" w:themeColor="text1"/>
+          <w:sz w:val="22"/>
+          <w:szCs w:val="22"/>
+        </w:rPr>
+        <w:t xml:space="preserve"> her </w:t>
+      </w:r>
+      <w:proofErr w:type="spellStart"/>
+      <w:r>
+        <w:rPr>
+          <w:color w:val="000000" w:themeColor="text1"/>
+          <w:sz w:val="22"/>
+          <w:szCs w:val="22"/>
+        </w:rPr>
+        <w:t>node</w:t>
+      </w:r>
+      <w:proofErr w:type="spellEnd"/>
+      <w:r>
+        <w:rPr>
+          <w:color w:val="000000" w:themeColor="text1"/>
+          <w:sz w:val="22"/>
+          <w:szCs w:val="22"/>
+        </w:rPr>
+        <w:t xml:space="preserve"> yalnızca sonraki </w:t>
+      </w:r>
+      <w:proofErr w:type="spellStart"/>
+      <w:r>
+        <w:rPr>
+          <w:color w:val="000000" w:themeColor="text1"/>
+          <w:sz w:val="22"/>
+          <w:szCs w:val="22"/>
+        </w:rPr>
+        <w:t>node'u</w:t>
+      </w:r>
+      <w:proofErr w:type="spellEnd"/>
+      <w:r>
+        <w:rPr>
+          <w:color w:val="000000" w:themeColor="text1"/>
+          <w:sz w:val="22"/>
+          <w:szCs w:val="22"/>
+        </w:rPr>
+        <w:t xml:space="preserve"> gösterirken, </w:t>
+      </w:r>
+      <w:proofErr w:type="spellStart"/>
+      <w:r>
+        <w:rPr>
+          <w:color w:val="000000" w:themeColor="text1"/>
+          <w:sz w:val="22"/>
+          <w:szCs w:val="22"/>
+        </w:rPr>
+        <w:t>doubly</w:t>
+      </w:r>
+      <w:proofErr w:type="spellEnd"/>
+      <w:r>
+        <w:rPr>
+          <w:color w:val="000000" w:themeColor="text1"/>
+          <w:sz w:val="22"/>
+          <w:szCs w:val="22"/>
+        </w:rPr>
+        <w:t xml:space="preserve"> </w:t>
+      </w:r>
+      <w:proofErr w:type="spellStart"/>
+      <w:r>
+        <w:rPr>
+          <w:color w:val="000000" w:themeColor="text1"/>
+          <w:sz w:val="22"/>
+          <w:szCs w:val="22"/>
+        </w:rPr>
+        <w:t>linked</w:t>
+      </w:r>
+      <w:proofErr w:type="spellEnd"/>
+      <w:r>
+        <w:rPr>
+          <w:color w:val="000000" w:themeColor="text1"/>
+          <w:sz w:val="22"/>
+          <w:szCs w:val="22"/>
+        </w:rPr>
+        <w:t xml:space="preserve"> </w:t>
+      </w:r>
+      <w:proofErr w:type="spellStart"/>
+      <w:r>
+        <w:rPr>
+          <w:color w:val="000000" w:themeColor="text1"/>
+          <w:sz w:val="22"/>
+          <w:szCs w:val="22"/>
+        </w:rPr>
+        <w:t>listlerde</w:t>
+      </w:r>
+      <w:proofErr w:type="spellEnd"/>
+      <w:r>
+        <w:rPr>
+          <w:color w:val="000000" w:themeColor="text1"/>
+          <w:sz w:val="22"/>
+          <w:szCs w:val="22"/>
+        </w:rPr>
+        <w:t xml:space="preserve"> hem önceki hem de sonraki </w:t>
+      </w:r>
+      <w:proofErr w:type="spellStart"/>
+      <w:r>
+        <w:rPr>
+          <w:color w:val="000000" w:themeColor="text1"/>
+          <w:sz w:val="22"/>
+          <w:szCs w:val="22"/>
+        </w:rPr>
+        <w:t>node'a</w:t>
+      </w:r>
+      <w:proofErr w:type="spellEnd"/>
+      <w:r>
+        <w:rPr>
+          <w:color w:val="000000" w:themeColor="text1"/>
+          <w:sz w:val="22"/>
+          <w:szCs w:val="22"/>
+        </w:rPr>
+        <w:t xml:space="preserve"> bağlantı bulunur. </w:t>
+      </w:r>
+      <w:proofErr w:type="spellStart"/>
+      <w:r>
+        <w:rPr>
+          <w:color w:val="000000" w:themeColor="text1"/>
+          <w:sz w:val="22"/>
+          <w:szCs w:val="22"/>
+        </w:rPr>
+        <w:t>Circular</w:t>
+      </w:r>
+      <w:proofErr w:type="spellEnd"/>
+      <w:r>
+        <w:rPr>
+          <w:color w:val="000000" w:themeColor="text1"/>
+          <w:sz w:val="22"/>
+          <w:szCs w:val="22"/>
+        </w:rPr>
+        <w:t xml:space="preserve"> </w:t>
+      </w:r>
+      <w:proofErr w:type="spellStart"/>
+      <w:r>
+        <w:rPr>
+          <w:color w:val="000000" w:themeColor="text1"/>
+          <w:sz w:val="22"/>
+          <w:szCs w:val="22"/>
+        </w:rPr>
+        <w:t>linked</w:t>
+      </w:r>
+      <w:proofErr w:type="spellEnd"/>
+      <w:r>
+        <w:rPr>
+          <w:color w:val="000000" w:themeColor="text1"/>
+          <w:sz w:val="22"/>
+          <w:szCs w:val="22"/>
+        </w:rPr>
+        <w:t xml:space="preserve"> </w:t>
+      </w:r>
+      <w:proofErr w:type="spellStart"/>
+      <w:r>
+        <w:rPr>
+          <w:color w:val="000000" w:themeColor="text1"/>
+          <w:sz w:val="22"/>
+          <w:szCs w:val="22"/>
+        </w:rPr>
+        <w:t>listlerde</w:t>
+      </w:r>
+      <w:proofErr w:type="spellEnd"/>
+      <w:r>
+        <w:rPr>
+          <w:color w:val="000000" w:themeColor="text1"/>
+          <w:sz w:val="22"/>
+          <w:szCs w:val="22"/>
+        </w:rPr>
+        <w:t xml:space="preserve"> ise son </w:t>
+      </w:r>
+      <w:proofErr w:type="spellStart"/>
+      <w:r>
+        <w:rPr>
+          <w:color w:val="000000" w:themeColor="text1"/>
+          <w:sz w:val="22"/>
+          <w:szCs w:val="22"/>
+        </w:rPr>
+        <w:t>node</w:t>
+      </w:r>
+      <w:proofErr w:type="spellEnd"/>
+      <w:r>
+        <w:rPr>
+          <w:color w:val="000000" w:themeColor="text1"/>
+          <w:sz w:val="22"/>
+          <w:szCs w:val="22"/>
+        </w:rPr>
+        <w:t xml:space="preserve"> tekrar ilk </w:t>
+      </w:r>
+      <w:proofErr w:type="spellStart"/>
+      <w:r>
+        <w:rPr>
+          <w:color w:val="000000" w:themeColor="text1"/>
+          <w:sz w:val="22"/>
+          <w:szCs w:val="22"/>
+        </w:rPr>
+        <w:t>node'a</w:t>
+      </w:r>
+      <w:proofErr w:type="spellEnd"/>
+      <w:r>
+        <w:rPr>
+          <w:color w:val="000000" w:themeColor="text1"/>
+          <w:sz w:val="22"/>
+          <w:szCs w:val="22"/>
+        </w:rPr>
+        <w:t xml:space="preserve"> bağlanır. Bu yapıların kullanım şekilleri ihtiyaca göre değişmektedir.</w:t>
+      </w:r>
+    </w:p>
+    <w:p>
+      <w:pPr>
+        <w:pStyle w:val="Balk1"/>
+        <w:spacing w:before="300" w:after="150"/>
+        <w:rPr>
+          <w:color w:val="000000" w:themeColor="text1"/>
+          <w:sz w:val="22"/>
+          <w:szCs w:val="22"/>
+        </w:rPr>
+      </w:pPr>
+      <w:r>
+        <w:rPr>
+          <w:color w:val="000000" w:themeColor="text1"/>
+          <w:sz w:val="22"/>
+          <w:szCs w:val="22"/>
+        </w:rPr>
+        <w:t xml:space="preserve">    Özet olarak, </w:t>
+      </w:r>
+      <w:proofErr w:type="spellStart"/>
+      <w:r>
+        <w:rPr>
+          <w:color w:val="000000" w:themeColor="text1"/>
+          <w:sz w:val="22"/>
+          <w:szCs w:val="22"/>
+        </w:rPr>
+        <w:t>linked</w:t>
+      </w:r>
+      <w:proofErr w:type="spellEnd"/>
+      <w:r>
+        <w:rPr>
+          <w:color w:val="000000" w:themeColor="text1"/>
+          <w:sz w:val="22"/>
+          <w:szCs w:val="22"/>
+        </w:rPr>
+        <w:t xml:space="preserve"> </w:t>
+      </w:r>
+      <w:proofErr w:type="spellStart"/>
+      <w:r>
+        <w:rPr>
+          <w:color w:val="000000" w:themeColor="text1"/>
+          <w:sz w:val="22"/>
+          <w:szCs w:val="22"/>
+        </w:rPr>
+        <w:t>listler</w:t>
+      </w:r>
+      <w:proofErr w:type="spellEnd"/>
+      <w:r>
+        <w:rPr>
+          <w:color w:val="000000" w:themeColor="text1"/>
+          <w:sz w:val="22"/>
+          <w:szCs w:val="22"/>
+        </w:rPr>
+        <w:t xml:space="preserve"> eleman ekleme, silme ve liste üzerinde dolaşma gibi işlemlerde farklı avantajlar sunan, Queue ve </w:t>
+      </w:r>
+      <w:proofErr w:type="spellStart"/>
+      <w:r>
+        <w:rPr>
+          <w:color w:val="000000" w:themeColor="text1"/>
+          <w:sz w:val="22"/>
+          <w:szCs w:val="22"/>
+        </w:rPr>
+        <w:t>Stack</w:t>
+      </w:r>
+      <w:proofErr w:type="spellEnd"/>
+      <w:r>
+        <w:rPr>
+          <w:color w:val="000000" w:themeColor="text1"/>
+          <w:sz w:val="22"/>
+          <w:szCs w:val="22"/>
+        </w:rPr>
+        <w:t xml:space="preserve"> gibi veri yapılarının oluşturulmasında da kullanılabilen önemli bir veri yapısıdır.</w:t>
+      </w:r>
+    </w:p>
+    <w:p>
+      <w:pPr>
+        <w:pStyle w:val="Balk1"/>
+        <w:spacing w:before="300" w:after="150"/>
+        <w:rPr>
+          <w:color w:val="000000" w:themeColor="text1"/>
+          <w:sz w:val="22"/>
+          <w:szCs w:val="22"/>
+        </w:rPr>
+      </w:pPr>
+    </w:p>
+    <w:p>
+      <w:pPr>
+        <w:pStyle w:val="Balk1"/>
+        <w:spacing w:before="300" w:after="150"/>
+        <w:rPr>
+          <w:color w:val="000000" w:themeColor="text1"/>
+        </w:rPr>
+      </w:pPr>
     </w:p>
     <w:p>
       <w:pPr>
@@ -1086,12 +2375,6 @@
         <w:gridCol w:w="2340"/>
       </w:tblGrid>
       <w:tr>
-        <w:tblPrEx>
-          <w:tblCellMar>
-            <w:top w:w="0" w:type="dxa"/>
-            <w:bottom w:w="0" w:type="dxa"/>
-          </w:tblCellMar>
-        </w:tblPrEx>
         <w:tc>
           <w:tcPr>
             <w:tcW w:w="2340" w:type="dxa"/>
@@ -1178,12 +2461,6 @@
         </w:tc>
       </w:tr>
       <w:tr>
-        <w:tblPrEx>
-          <w:tblCellMar>
-            <w:top w:w="0" w:type="dxa"/>
-            <w:bottom w:w="0" w:type="dxa"/>
-          </w:tblCellMar>
-        </w:tblPrEx>
         <w:tc>
           <w:tcPr>
             <w:tcW w:w="2340" w:type="dxa"/>
@@ -1258,12 +2535,6 @@
         </w:tc>
       </w:tr>
       <w:tr>
-        <w:tblPrEx>
-          <w:tblCellMar>
-            <w:top w:w="0" w:type="dxa"/>
-            <w:bottom w:w="0" w:type="dxa"/>
-          </w:tblCellMar>
-        </w:tblPrEx>
         <w:tc>
           <w:tcPr>
             <w:tcW w:w="2340" w:type="dxa"/>
@@ -1338,12 +2609,6 @@
         </w:tc>
       </w:tr>
       <w:tr>
-        <w:tblPrEx>
-          <w:tblCellMar>
-            <w:top w:w="0" w:type="dxa"/>
-            <w:bottom w:w="0" w:type="dxa"/>
-          </w:tblCellMar>
-        </w:tblPrEx>
         <w:tc>
           <w:tcPr>
             <w:tcW w:w="2340" w:type="dxa"/>
@@ -1418,12 +2683,6 @@
         </w:tc>
       </w:tr>
       <w:tr>
-        <w:tblPrEx>
-          <w:tblCellMar>
-            <w:top w:w="0" w:type="dxa"/>
-            <w:bottom w:w="0" w:type="dxa"/>
-          </w:tblCellMar>
-        </w:tblPrEx>
         <w:tc>
           <w:tcPr>
             <w:tcW w:w="2340" w:type="dxa"/>
@@ -1498,12 +2757,6 @@
         </w:tc>
       </w:tr>
       <w:tr>
-        <w:tblPrEx>
-          <w:tblCellMar>
-            <w:top w:w="0" w:type="dxa"/>
-            <w:bottom w:w="0" w:type="dxa"/>
-          </w:tblCellMar>
-        </w:tblPrEx>
         <w:tc>
           <w:tcPr>
             <w:tcW w:w="2340" w:type="dxa"/>
@@ -1578,12 +2831,6 @@
         </w:tc>
       </w:tr>
       <w:tr>
-        <w:tblPrEx>
-          <w:tblCellMar>
-            <w:top w:w="0" w:type="dxa"/>
-            <w:bottom w:w="0" w:type="dxa"/>
-          </w:tblCellMar>
-        </w:tblPrEx>
         <w:tc>
           <w:tcPr>
             <w:tcW w:w="2340" w:type="dxa"/>
@@ -1640,12 +2887,6 @@
         </w:tc>
       </w:tr>
       <w:tr>
-        <w:tblPrEx>
-          <w:tblCellMar>
-            <w:top w:w="0" w:type="dxa"/>
-            <w:bottom w:w="0" w:type="dxa"/>
-          </w:tblCellMar>
-        </w:tblPrEx>
         <w:tc>
           <w:tcPr>
             <w:tcW w:w="2340" w:type="dxa"/>
@@ -1737,7 +2978,6 @@
         <w:rPr>
           <w:color w:val="000000" w:themeColor="text1"/>
         </w:rPr>
-        <w:lastRenderedPageBreak/>
         <w:t>6. Haftalık Genel Değerlendirme</w:t>
       </w:r>
     </w:p>

</xml_diff>